<commit_message>
Update CVs, add PDF versions, dual download options
</commit_message>
<xml_diff>
--- a/assets/cv-english.docx
+++ b/assets/cv-english.docx
@@ -153,6 +153,27 @@
         </w:rPr>
         <w:t xml:space="preserve">github.com/Mahpan2222</w:t>
       </w:r>
+      <w:r>
+        <w:rPr>
+          <w:rFonts w:ascii="Georgia" w:cs="Georgia" w:eastAsia="Georgia" w:hAnsi="Georgia"/>
+          <w:color w:val="7A9AB5"/>
+          <w:sz w:val="19"/>
+          <w:szCs w:val="19"/>
+        </w:rPr>
+        <w:t xml:space="preserve">   ·   </w:t>
+      </w:r>
+      <w:hyperlink w:history="1" r:id="rIdhqdzh7a3076jilazzwejo">
+        <w:r>
+          <w:rPr>
+            <w:rFonts w:ascii="Georgia" w:cs="Georgia" w:eastAsia="Georgia" w:hAnsi="Georgia"/>
+            <w:color w:val="5B8DB8"/>
+            <w:sz w:val="19"/>
+            <w:szCs w:val="19"/>
+            <w:u w:val="single" w:color="5B8DB8"/>
+          </w:rPr>
+          <w:t xml:space="preserve">My Portfolio</w:t>
+        </w:r>
+      </w:hyperlink>
     </w:p>
     <w:p>
       <w:pPr>
@@ -618,7 +639,7 @@
           <w:sz w:val="20"/>
           <w:szCs w:val="20"/>
         </w:rPr>
-        <w:t xml:space="preserve">Building a real-time posture estimation system using seven IMUs fitted into a motorcycle jacket and helmet — a project that sits at the intersection of hardware integration and algorithm development</w:t>
+        <w:t xml:space="preserve">Building a real-time posture estimation system using seven IMUs fitted into a motorcycle jacket and helmet — sitting at the intersection of hardware integration and algorithm development</w:t>
       </w:r>
     </w:p>
     <w:p>
@@ -1114,7 +1135,7 @@
           <w:sz w:val="20"/>
           <w:szCs w:val="20"/>
         </w:rPr>
-        <w:t xml:space="preserve">Tools</w:t>
+        <w:t xml:space="preserve">Machine Learning</w:t>
       </w:r>
       <w:r>
         <w:t xml:space="preserve">	</w:t>
@@ -1126,7 +1147,7 @@
           <w:sz w:val="20"/>
           <w:szCs w:val="20"/>
         </w:rPr>
-        <w:t xml:space="preserve">MediaPipe  ·  Git  ·  ROS</w:t>
+        <w:t xml:space="preserve">Supervised learning  ·  Classification  ·  scikit-learn  ·  Neural networks (basic)</w:t>
       </w:r>
     </w:p>
     <w:p>
@@ -1207,7 +1228,7 @@
           <w:sz w:val="20"/>
           <w:szCs w:val="20"/>
         </w:rPr>
-        <w:t xml:space="preserve">Machine Learning</w:t>
+        <w:t xml:space="preserve">Tools</w:t>
       </w:r>
       <w:r>
         <w:t xml:space="preserve">	</w:t>
@@ -1219,7 +1240,7 @@
           <w:sz w:val="20"/>
           <w:szCs w:val="20"/>
         </w:rPr>
-        <w:t xml:space="preserve">Supervised learning  ·  Classification  ·  scikit-learn  ·  Neural networks (basic)</w:t>
+        <w:t xml:space="preserve">MediaPipe  ·  Git  ·  ROS</w:t>
       </w:r>
     </w:p>
     <w:p>
@@ -1650,6 +1671,192 @@
         <w:t xml:space="preserve">Phone: _______________   |   Email: _______________</w:t>
       </w:r>
     </w:p>
+    <w:p>
+      <w:pPr>
+        <w:spacing w:after="160" w:before="0"/>
+      </w:pPr>
+      <w:r>
+        <w:t xml:space="preserve"/>
+      </w:r>
+    </w:p>
+    <w:p>
+      <w:pPr>
+        <w:pBdr>
+          <w:top w:val="single" w:color="B8D4ED" w:sz="3" w:space="0"/>
+        </w:pBdr>
+        <w:spacing w:after="0" w:before="0"/>
+      </w:pPr>
+      <w:r>
+        <w:t xml:space="preserve"/>
+      </w:r>
+    </w:p>
+    <w:tbl>
+      <w:tblPr>
+        <w:tblW w:type="dxa" w:w="9346"/>
+        <w:tblBorders>
+          <w:top w:val="single" w:color="auto" w:sz="4"/>
+          <w:left w:val="single" w:color="auto" w:sz="4"/>
+          <w:bottom w:val="single" w:color="auto" w:sz="4"/>
+          <w:right w:val="single" w:color="auto" w:sz="4"/>
+          <w:insideH w:val="single" w:color="auto" w:sz="4"/>
+          <w:insideV w:val="single" w:color="auto" w:sz="4"/>
+        </w:tblBorders>
+      </w:tblPr>
+      <w:tblGrid>
+        <w:gridCol w:w="7846"/>
+        <w:gridCol w:w="1500"/>
+      </w:tblGrid>
+      <w:tr>
+        <w:tc>
+          <w:tcPr>
+            <w:tcW w:type="dxa" w:w="7846"/>
+            <w:tcBorders>
+              <w:top w:val="none" w:color="FFFFFF" w:sz="0"/>
+              <w:left w:val="none" w:color="FFFFFF" w:sz="0"/>
+              <w:bottom w:val="none" w:color="FFFFFF" w:sz="0"/>
+              <w:right w:val="none" w:color="FFFFFF" w:sz="0"/>
+            </w:tcBorders>
+            <w:tcMar>
+              <w:top w:type="dxa" w:w="120"/>
+              <w:left w:type="dxa" w:w="0"/>
+              <w:bottom w:type="dxa" w:w="120"/>
+              <w:right w:type="dxa" w:w="200"/>
+            </w:tcMar>
+            <w:vAlign w:val="center"/>
+          </w:tcPr>
+          <w:p>
+            <w:pPr>
+              <w:spacing w:after="30" w:before="0"/>
+            </w:pPr>
+            <w:r>
+              <w:rPr>
+                <w:rFonts w:ascii="Georgia" w:cs="Georgia" w:eastAsia="Georgia" w:hAnsi="Georgia"/>
+                <w:i/>
+                <w:iCs/>
+                <w:color w:val="555555"/>
+                <w:sz w:val="19"/>
+                <w:szCs w:val="19"/>
+              </w:rPr>
+              <w:t xml:space="preserve">Visit my portfolio online</w:t>
+            </w:r>
+          </w:p>
+          <w:p>
+            <w:pPr>
+              <w:spacing w:after="30" w:before="0"/>
+            </w:pPr>
+            <w:hyperlink w:history="1" r:id="rIdo15dnpbkqrx1b7zqs_ij7">
+              <w:r>
+                <w:rPr>
+                  <w:rFonts w:ascii="Georgia" w:cs="Georgia" w:eastAsia="Georgia" w:hAnsi="Georgia"/>
+                  <w:b/>
+                  <w:bCs/>
+                  <w:color w:val="5B8DB8"/>
+                  <w:sz w:val="20"/>
+                  <w:szCs w:val="20"/>
+                  <w:u w:val="single" w:color="5B8DB8"/>
+                </w:rPr>
+                <w:t xml:space="preserve">mahdi-panahi.vercel.app</w:t>
+              </w:r>
+            </w:hyperlink>
+          </w:p>
+          <w:p>
+            <w:pPr>
+              <w:spacing w:after="0" w:before="0"/>
+            </w:pPr>
+            <w:r>
+              <w:rPr>
+                <w:rFonts w:ascii="Georgia" w:cs="Georgia" w:eastAsia="Georgia" w:hAnsi="Georgia"/>
+                <w:color w:val="7A9AB5"/>
+                <w:sz w:val="18"/>
+                <w:szCs w:val="18"/>
+              </w:rPr>
+              <w:t xml:space="preserve">Projects  ·  Research  ·  Downloadable CV</w:t>
+            </w:r>
+          </w:p>
+        </w:tc>
+        <w:tc>
+          <w:tcPr>
+            <w:tcW w:type="dxa" w:w="1500"/>
+            <w:tcBorders>
+              <w:top w:val="none" w:color="FFFFFF" w:sz="0"/>
+              <w:left w:val="none" w:color="FFFFFF" w:sz="0"/>
+              <w:bottom w:val="none" w:color="FFFFFF" w:sz="0"/>
+              <w:right w:val="none" w:color="FFFFFF" w:sz="0"/>
+            </w:tcBorders>
+            <w:tcMar>
+              <w:top w:type="dxa" w:w="100"/>
+              <w:left w:type="dxa" w:w="100"/>
+              <w:bottom w:type="dxa" w:w="100"/>
+              <w:right w:type="dxa" w:w="0"/>
+            </w:tcMar>
+            <w:vAlign w:val="center"/>
+          </w:tcPr>
+          <w:p>
+            <w:pPr>
+              <w:spacing w:after="4" w:before="0"/>
+              <w:jc w:val="right"/>
+            </w:pPr>
+            <w:r>
+              <w:drawing>
+                <wp:inline distT="0" distB="0" distL="0" distR="0">
+                  <wp:extent cx="838200" cy="838200"/>
+                  <wp:effectExtent t="0" r="0" b="0" l="0"/>
+                  <wp:docPr id="1" name="" descr="" title=""/>
+                  <wp:cNvGraphicFramePr>
+                    <a:graphicFrameLocks xmlns:a="http://schemas.openxmlformats.org/drawingml/2006/main" noChangeAspect="1"/>
+                  </wp:cNvGraphicFramePr>
+                  <a:graphic xmlns:a="http://schemas.openxmlformats.org/drawingml/2006/main">
+                    <a:graphicData uri="http://schemas.openxmlformats.org/drawingml/2006/picture">
+                      <pic:pic xmlns:pic="http://schemas.openxmlformats.org/drawingml/2006/picture">
+                        <pic:nvPicPr>
+                          <pic:cNvPr id="0" name="" descr=""/>
+                          <pic:cNvPicPr>
+                            <a:picLocks noChangeAspect="1" noChangeArrowheads="1"/>
+                          </pic:cNvPicPr>
+                        </pic:nvPicPr>
+                        <pic:blipFill>
+                          <a:blip r:embed="rId7" cstate="none"/>
+                          <a:srcRect/>
+                          <a:stretch>
+                            <a:fillRect/>
+                          </a:stretch>
+                        </pic:blipFill>
+                        <pic:spPr bwMode="auto">
+                          <a:xfrm>
+                            <a:off x="0" y="0"/>
+                            <a:ext cx="838200" cy="838200"/>
+                          </a:xfrm>
+                          <a:prstGeom prst="rect">
+                            <a:avLst/>
+                          </a:prstGeom>
+                        </pic:spPr>
+                      </pic:pic>
+                    </a:graphicData>
+                  </a:graphic>
+                </wp:inline>
+              </w:drawing>
+            </w:r>
+          </w:p>
+          <w:p>
+            <w:pPr>
+              <w:spacing w:after="0" w:before="0"/>
+              <w:jc w:val="right"/>
+            </w:pPr>
+            <w:r>
+              <w:rPr>
+                <w:rFonts w:ascii="Georgia" w:cs="Georgia" w:eastAsia="Georgia" w:hAnsi="Georgia"/>
+                <w:i/>
+                <w:iCs/>
+                <w:color w:val="7A9AB5"/>
+                <w:sz w:val="14"/>
+                <w:szCs w:val="14"/>
+              </w:rPr>
+              <w:t xml:space="preserve">Scan to open</w:t>
+            </w:r>
+          </w:p>
+        </w:tc>
+      </w:tr>
+    </w:tbl>
     <w:sectPr>
       <w:pgSz w:w="11906" w:h="16838" w:orient="portrait"/>
       <w:pgMar w:top="900" w:right="960" w:bottom="900" w:left="960" w:header="708" w:footer="708" w:gutter="0"/>

</xml_diff>

<commit_message>
Update CV: paper accepted, fix skills, natural language polish
- Paper status: Under Review → Accepted — IEEE ETFA 2026 (both languages)
- Profile: 'submitted' → 'accepted at IEEE ETFA 2026'
- Source code citation: points to obakha22 repo (correct author)
- Header github link: remains github.com/Mahpan2222 (personal)
- Skills: remove 'Advanced Java', add JavaScript to Frontend
- Swedish methods row translated to Swedish
- Removed '(basic)' qualifier from ML row
</commit_message>
<xml_diff>
--- a/assets/cv-english.docx
+++ b/assets/cv-english.docx
@@ -79,7 +79,7 @@
           <w:sz w:val="19"/>
           <w:szCs w:val="19"/>
         </w:rPr>
-        <w:t xml:space="preserve">Helsingborg, Sweden</w:t>
+        <w:t xml:space="preserve">Helsingborg, Sweden   ·   070 449 42 63   ·   swemahdi@gmail.com   ·   mahpan22@student.hh.se   ·   github.com/Mahpan2222   ·   </w:t>
       </w:r>
       <w:r>
         <w:rPr>
@@ -88,7 +88,6 @@
           <w:sz w:val="19"/>
           <w:szCs w:val="19"/>
         </w:rPr>
-        <w:t xml:space="preserve">   ·   </w:t>
       </w:r>
       <w:r>
         <w:rPr>
@@ -97,7 +96,6 @@
           <w:sz w:val="19"/>
           <w:szCs w:val="19"/>
         </w:rPr>
-        <w:t xml:space="preserve">070 449 42 63</w:t>
       </w:r>
       <w:r>
         <w:rPr>
@@ -106,7 +104,6 @@
           <w:sz w:val="19"/>
           <w:szCs w:val="19"/>
         </w:rPr>
-        <w:t xml:space="preserve">   ·   </w:t>
       </w:r>
       <w:r>
         <w:rPr>
@@ -115,7 +112,6 @@
           <w:sz w:val="19"/>
           <w:szCs w:val="19"/>
         </w:rPr>
-        <w:t xml:space="preserve">swemahdi@gmail.com</w:t>
       </w:r>
       <w:r>
         <w:rPr>
@@ -124,7 +120,6 @@
           <w:sz w:val="19"/>
           <w:szCs w:val="19"/>
         </w:rPr>
-        <w:t xml:space="preserve">   ·   </w:t>
       </w:r>
       <w:r>
         <w:rPr>
@@ -133,7 +128,6 @@
           <w:sz w:val="19"/>
           <w:szCs w:val="19"/>
         </w:rPr>
-        <w:t xml:space="preserve">mahpan22@student.hh.se</w:t>
       </w:r>
       <w:r>
         <w:rPr>
@@ -142,7 +136,6 @@
           <w:sz w:val="19"/>
           <w:szCs w:val="19"/>
         </w:rPr>
-        <w:t xml:space="preserve">   ·   </w:t>
       </w:r>
       <w:r>
         <w:rPr>
@@ -151,7 +144,6 @@
           <w:sz w:val="19"/>
           <w:szCs w:val="19"/>
         </w:rPr>
-        <w:t xml:space="preserve">github.com/Mahpan2222</w:t>
       </w:r>
       <w:r>
         <w:rPr>
@@ -160,7 +152,6 @@
           <w:sz w:val="19"/>
           <w:szCs w:val="19"/>
         </w:rPr>
-        <w:t xml:space="preserve">   ·   </w:t>
       </w:r>
       <w:hyperlink w:history="1" r:id="rIdhqdzh7a3076jilazzwejo">
         <w:r>
@@ -234,7 +225,7 @@
           <w:sz w:val="20"/>
           <w:szCs w:val="20"/>
         </w:rPr>
-        <w:t xml:space="preserve">Computer engineering student at Halmstad University completing a B.Sc. in Computer Engineering. Co-author of a peer-reviewed IEEE conference paper on cryptographic performance for V2X vehicle safety systems, submitted to ETFA 2026. Currently completing a paid industry thesis at Autoliv on real-time posture estimation using multi-IMU sensor systems. Alongside studies, maintained consistent employment over three years — recognised by management at multiple levels for reliability and initiative.</w:t>
+        <w:t>Computer engineering student at Halmstad University completing a B.Sc. in Computer Engineering. Co-author of a peer-reviewed IEEE conference paper on cryptographic performance for V2X vehicle safety systems, accepted at IEEE ETFA 2026. Currently completing a paid industry thesis at Autoliv on real-time posture estimation using multi-IMU sensor systems. Alongside studies, maintained consistent employment over three years — recognised by management at multiple levels for reliability and initiative.</w:t>
       </w:r>
     </w:p>
     <w:p>
@@ -312,7 +303,7 @@
           <w:sz w:val="20"/>
           <w:szCs w:val="20"/>
         </w:rPr>
-        <w:t xml:space="preserve">IEEE ETFA 2026 (Emerging Technologies &amp; Factory Automation), Västerås, Sweden  ·  Status: Under Review</w:t>
+        <w:t>IEEE ETFA 2026 (Emerging Technologies &amp; Factory Automation), Västerås, Sweden  ·  Status: Accepted — IEEE ETFA 2026</w:t>
       </w:r>
     </w:p>
     <w:p>
@@ -426,7 +417,7 @@
           <w:sz w:val="20"/>
           <w:szCs w:val="20"/>
         </w:rPr>
-        <w:t xml:space="preserve">Source code publicly available — github.com/Mahpan2222</w:t>
+        <w:t>Source code publicly available — github.com/obakha22</w:t>
       </w:r>
     </w:p>
     <w:p>
@@ -1042,19 +1033,18 @@
           <w:sz w:val="20"/>
           <w:szCs w:val="20"/>
         </w:rPr>
-        <w:t xml:space="preserve">Languages</w:t>
-      </w:r>
-      <w:r>
-        <w:t xml:space="preserve">	</w:t>
-      </w:r>
-      <w:r>
-        <w:rPr>
-          <w:rFonts w:ascii="Georgia" w:cs="Georgia" w:eastAsia="Georgia" w:hAnsi="Georgia"/>
-          <w:color w:val="1E1E1E"/>
-          <w:sz w:val="20"/>
-          <w:szCs w:val="20"/>
-        </w:rPr>
-        <w:t xml:space="preserve">Python  ·  Java  ·  Advanced Java  ·  C / C++  ·  MATLAB  ·  Bash</w:t>
+        <w:t>Languages</w:t>
+        <w:tab/>
+        <w:t>Python  ·  Java  ·  C / C++  ·  PHP  ·  JavaScript  ·  Bash</w:t>
+      </w:r>
+      <w:r/>
+      <w:r>
+        <w:rPr>
+          <w:rFonts w:ascii="Georgia" w:cs="Georgia" w:eastAsia="Georgia" w:hAnsi="Georgia"/>
+          <w:color w:val="1E1E1E"/>
+          <w:sz w:val="20"/>
+          <w:szCs w:val="20"/>
+        </w:rPr>
       </w:r>
     </w:p>
     <w:p>
@@ -1135,19 +1125,18 @@
           <w:sz w:val="20"/>
           <w:szCs w:val="20"/>
         </w:rPr>
-        <w:t xml:space="preserve">Machine Learning</w:t>
-      </w:r>
-      <w:r>
-        <w:t xml:space="preserve">	</w:t>
-      </w:r>
-      <w:r>
-        <w:rPr>
-          <w:rFonts w:ascii="Georgia" w:cs="Georgia" w:eastAsia="Georgia" w:hAnsi="Georgia"/>
-          <w:color w:val="1E1E1E"/>
-          <w:sz w:val="20"/>
-          <w:szCs w:val="20"/>
-        </w:rPr>
-        <w:t xml:space="preserve">Supervised learning  ·  Classification  ·  scikit-learn  ·  Neural networks (basic)</w:t>
+        <w:t>Machine Learning</w:t>
+        <w:tab/>
+        <w:t>Supervised learning  ·  Classification  ·  scikit-learn</w:t>
+      </w:r>
+      <w:r/>
+      <w:r>
+        <w:rPr>
+          <w:rFonts w:ascii="Georgia" w:cs="Georgia" w:eastAsia="Georgia" w:hAnsi="Georgia"/>
+          <w:color w:val="1E1E1E"/>
+          <w:sz w:val="20"/>
+          <w:szCs w:val="20"/>
+        </w:rPr>
       </w:r>
     </w:p>
     <w:p>
@@ -1166,19 +1155,18 @@
           <w:sz w:val="20"/>
           <w:szCs w:val="20"/>
         </w:rPr>
-        <w:t xml:space="preserve">Frontend</w:t>
-      </w:r>
-      <w:r>
-        <w:t xml:space="preserve">	</w:t>
-      </w:r>
-      <w:r>
-        <w:rPr>
-          <w:rFonts w:ascii="Georgia" w:cs="Georgia" w:eastAsia="Georgia" w:hAnsi="Georgia"/>
-          <w:color w:val="1E1E1E"/>
-          <w:sz w:val="20"/>
-          <w:szCs w:val="20"/>
-        </w:rPr>
-        <w:t xml:space="preserve">HTML  ·  CSS  ·  PHP</w:t>
+        <w:t>Frontend</w:t>
+        <w:tab/>
+        <w:t>HTML  ·  CSS  ·  JavaScript</w:t>
+      </w:r>
+      <w:r/>
+      <w:r>
+        <w:rPr>
+          <w:rFonts w:ascii="Georgia" w:cs="Georgia" w:eastAsia="Georgia" w:hAnsi="Georgia"/>
+          <w:color w:val="1E1E1E"/>
+          <w:sz w:val="20"/>
+          <w:szCs w:val="20"/>
+        </w:rPr>
       </w:r>
     </w:p>
     <w:p>

</xml_diff>

<commit_message>
Update CVs: humanize language, fix posture translation, regenerate PDFs
</commit_message>
<xml_diff>
--- a/assets/cv-english.docx
+++ b/assets/cv-english.docx
@@ -225,7 +225,7 @@
           <w:sz w:val="20"/>
           <w:szCs w:val="20"/>
         </w:rPr>
-        <w:t>Computer engineering student at Halmstad University completing a B.Sc. in Computer Engineering. Co-author of a peer-reviewed IEEE conference paper on cryptographic performance for V2X vehicle safety systems, accepted at IEEE ETFA 2026. Currently completing a paid industry thesis at Autoliv on real-time posture estimation using multi-IMU sensor systems. Alongside studies, maintained consistent employment over three years — recognised by management at multiple levels for reliability and initiative.</w:t>
+        <w:t>Final-year Computer Engineering student at Halmstad University. Co-author of an IEEE conference paper on cryptographic performance for V2X vehicle safety systems, accepted at IEEE ETFA 2026. Currently doing a paid industry thesis at Autoliv on real-time posture estimation with multi-IMU sensors. Alongside full-time studies, I have worked part-time for over three years, with references from managers at several levels.</w:t>
       </w:r>
     </w:p>
     <w:p>
@@ -303,7 +303,7 @@
           <w:sz w:val="20"/>
           <w:szCs w:val="20"/>
         </w:rPr>
-        <w:t>IEEE ETFA 2026 (Emerging Technologies &amp; Factory Automation), Västerås, Sweden  ·  Status: Accepted — IEEE ETFA 2026</w:t>
+        <w:t>IEEE ETFA 2026 (Emerging Technologies &amp; Factory Automation), Västerås, Sweden  ·  Status: Accepted</w:t>
       </w:r>
     </w:p>
     <w:p>
@@ -379,7 +379,7 @@
           <w:sz w:val="20"/>
           <w:szCs w:val="20"/>
         </w:rPr>
-        <w:t xml:space="preserve">Key finding: Ed25519 achieves up to 27,000 signatures per second — optimal for high-density vehicular safety environments within the strict 100 ms latency window</w:t>
+        <w:t>Key finding: Ed25519 achieves up to 27,000 signatures per second — fast enough for dense traffic within the strict 100 ms latency limit</w:t>
       </w:r>
     </w:p>
     <w:p>
@@ -398,7 +398,7 @@
           <w:sz w:val="20"/>
           <w:szCs w:val="20"/>
         </w:rPr>
-        <w:t xml:space="preserve">Implemented using Java Microbenchmark Harness (JMH) and Bouncy Castle cryptographic provider</w:t>
+        <w:t>Implemented using Java Microbenchmark Harness (JMH) and the Bouncy Castle cryptography library</w:t>
       </w:r>
     </w:p>
     <w:p>
@@ -533,7 +533,7 @@
           <w:sz w:val="20"/>
           <w:szCs w:val="20"/>
         </w:rPr>
-        <w:t xml:space="preserve">Final-year industry thesis completed in collaboration with Autoliv — see Degree Thesis below</w:t>
+        <w:t>Final-year industry thesis in collaboration with Autoliv — see Degree Thesis below</w:t>
       </w:r>
     </w:p>
     <w:p>
@@ -630,7 +630,7 @@
           <w:sz w:val="20"/>
           <w:szCs w:val="20"/>
         </w:rPr>
-        <w:t xml:space="preserve">Building a real-time posture estimation system using seven IMUs fitted into a motorcycle jacket and helmet — sitting at the intersection of hardware integration and algorithm development</w:t>
+        <w:t>Building a real-time posture estimation system using seven IMUs fitted into a motorcycle jacket and helmet</w:t>
       </w:r>
     </w:p>
     <w:p>
@@ -649,7 +649,7 @@
           <w:sz w:val="20"/>
           <w:szCs w:val="20"/>
         </w:rPr>
-        <w:t xml:space="preserve">Implemented and compared Madgwick, Mahony and Extended Kalman Filter algorithms to handle sensor drift and maintain accurate orientation over time</w:t>
+        <w:t>Comparing Madgwick, Mahony and Extended Kalman Filter algorithms to handle sensor drift and keep orientation accurate over time</w:t>
       </w:r>
     </w:p>
     <w:p>
@@ -668,7 +668,7 @@
           <w:sz w:val="20"/>
           <w:szCs w:val="20"/>
         </w:rPr>
-        <w:t xml:space="preserve">Validated results against a video-based ground truth pipeline built with MediaPipe, measuring accuracy using RMSE of joint angles</w:t>
+        <w:t>Validating results against a video-based ground truth built with MediaPipe, measuring accuracy with RMSE of joint angles</w:t>
       </w:r>
     </w:p>
     <w:p>
@@ -687,7 +687,7 @@
           <w:sz w:val="20"/>
           <w:szCs w:val="20"/>
         </w:rPr>
-        <w:t xml:space="preserve">Handles the full hardware stack — ESP32 microcontrollers, microROS firmware and Wi-Fi data streaming</w:t>
+        <w:t>Responsible for the full hardware stack — ESP32 microcontrollers, microROS firmware and Wi-Fi data streaming</w:t>
       </w:r>
     </w:p>
     <w:p>
@@ -706,7 +706,7 @@
           <w:sz w:val="20"/>
           <w:szCs w:val="20"/>
         </w:rPr>
-        <w:t xml:space="preserve">Formalised as a paid engagement with a signed contract from Autoliv</w:t>
+        <w:t>Paid thesis position under a signed agreement with Autoliv</w:t>
       </w:r>
     </w:p>
     <w:p>
@@ -803,7 +803,7 @@
           <w:sz w:val="20"/>
           <w:szCs w:val="20"/>
         </w:rPr>
-        <w:t xml:space="preserve">Been working here throughout my studies — over three years now, part-time alongside a full course load at one of Sweden's largest garden and plant retail chains</w:t>
+        <w:t>Over three years of part-time work alongside full-time studies, at one of Sweden's largest garden and plant retail chains</w:t>
       </w:r>
     </w:p>
     <w:p>
@@ -841,7 +841,7 @@
           <w:sz w:val="20"/>
           <w:szCs w:val="20"/>
         </w:rPr>
-        <w:t xml:space="preserve">Built solid working relationships across the team and with management at several levels — five managers have offered to serve as references</w:t>
+        <w:t>Good working relationships across the team and with management — five managers have offered to act as references</w:t>
       </w:r>
     </w:p>
     <w:p>
@@ -909,7 +909,7 @@
           <w:sz w:val="20"/>
           <w:szCs w:val="20"/>
         </w:rPr>
-        <w:t xml:space="preserve">Worked summers from the age of 17 across various restaurant and service roles — picked up a lot about working under pressure and adapting fast to different teams</w:t>
+        <w:t>Worked summers from the age of 17 across various restaurant and service roles — learned to work under pressure and adapt quickly to new teams</w:t>
       </w:r>
     </w:p>
     <w:p>
@@ -928,7 +928,7 @@
           <w:sz w:val="22"/>
           <w:szCs w:val="22"/>
         </w:rPr>
-        <w:t xml:space="preserve">Renovation &amp; Recolouring Work (seasonal)</w:t>
+        <w:t>Renovation &amp; Painting Work (seasonal)</w:t>
       </w:r>
       <w:r>
         <w:t xml:space="preserve">	</w:t>
@@ -977,7 +977,7 @@
           <w:sz w:val="20"/>
           <w:szCs w:val="20"/>
         </w:rPr>
-        <w:t xml:space="preserve">Took on interior recolouring and renovation jobs during summers, managing client contact and the work independently from start to finish</w:t>
+        <w:t>Took on interior painting and renovation jobs during summers, handling client contact and the work independently from start to finish</w:t>
       </w:r>
     </w:p>
     <w:p>
@@ -1315,7 +1315,7 @@
           <w:sz w:val="20"/>
           <w:szCs w:val="20"/>
         </w:rPr>
-        <w:t xml:space="preserve">Svenska</w:t>
+        <w:t>Swedish</w:t>
       </w:r>
       <w:r>
         <w:t xml:space="preserve">	</w:t>
@@ -1458,7 +1458,7 @@
           <w:sz w:val="20"/>
           <w:szCs w:val="20"/>
         </w:rPr>
-        <w:t xml:space="preserve">Department Manager / Förman  ·  Blomsterlandet</w:t>
+        <w:t>Department Manager  ·  Blomsterlandet</w:t>
       </w:r>
     </w:p>
     <w:p>

</xml_diff>

<commit_message>
Link project cards to real repos, add OG tags and README, update CVs for Axis application
</commit_message>
<xml_diff>
--- a/assets/cv-english.docx
+++ b/assets/cv-english.docx
@@ -225,7 +225,7 @@
           <w:sz w:val="20"/>
           <w:szCs w:val="20"/>
         </w:rPr>
-        <w:t>Final-year Computer Engineering student at Halmstad University. Co-author of an IEEE conference paper on cryptographic performance for V2X vehicle safety systems, accepted at IEEE ETFA 2026. Currently doing a paid industry thesis at Autoliv on real-time posture estimation with multi-IMU sensors. Alongside full-time studies, I have worked part-time for over three years, with references from managers at several levels.</w:t>
+        <w:t>Computer Engineering student at Halmstad University, currently completing a paid industry thesis at Autoliv with remaining coursework in the programme. Co-author of an IEEE conference paper on cryptographic performance for V2X vehicle safety systems, accepted at IEEE ETFA 2026. Comfortable in Linux and Windows environments, Python, and systematic testing and validation of embedded real-time systems. Over three years of part-time work alongside full-time studies.</w:t>
       </w:r>
     </w:p>
     <w:p>
@@ -417,8 +417,20 @@
           <w:sz w:val="20"/>
           <w:szCs w:val="20"/>
         </w:rPr>
-        <w:t>Source code publicly available — github.com/obakha22</w:t>
-      </w:r>
+        <w:t xml:space="preserve">Source code: </w:t>
+      </w:r>
+      <w:hyperlink r:id="rId8">
+        <w:r>
+          <w:rPr>
+            <w:rStyle w:val="Hyperlink"/>
+            <w:rFonts w:ascii="Georgia" w:cs="Georgia" w:eastAsia="Georgia" w:hAnsi="Georgia"/>
+            <w:color w:val="1E1E1E"/>
+            <w:sz w:val="20"/>
+            <w:szCs w:val="20"/>
+          </w:rPr>
+          <w:t>github.com/Mahpan2222</w:t>
+        </w:r>
+      </w:hyperlink>
     </w:p>
     <w:p>
       <w:pPr>
@@ -533,7 +545,7 @@
           <w:sz w:val="20"/>
           <w:szCs w:val="20"/>
         </w:rPr>
-        <w:t>Final-year industry thesis in collaboration with Autoliv — see Degree Thesis below</w:t>
+        <w:t>Industry thesis in collaboration with Autoliv — see Degree Thesis below</w:t>
       </w:r>
     </w:p>
     <w:p>
@@ -1063,19 +1075,19 @@
           <w:sz w:val="20"/>
           <w:szCs w:val="20"/>
         </w:rPr>
-        <w:t xml:space="preserve">Embedded</w:t>
-      </w:r>
-      <w:r>
-        <w:t xml:space="preserve">	</w:t>
-      </w:r>
-      <w:r>
-        <w:rPr>
-          <w:rFonts w:ascii="Georgia" w:cs="Georgia" w:eastAsia="Georgia" w:hAnsi="Georgia"/>
-          <w:color w:val="1E1E1E"/>
-          <w:sz w:val="20"/>
-          <w:szCs w:val="20"/>
-        </w:rPr>
-        <w:t xml:space="preserve">ESP32  ·  microROS  ·  IMU integration  ·  Wi-Fi data streaming</w:t>
+        <w:t>Embedded</w:t>
+      </w:r>
+      <w:r>
+        <w:tab/>
+      </w:r>
+      <w:r>
+        <w:rPr>
+          <w:rFonts w:ascii="Georgia" w:cs="Georgia" w:eastAsia="Georgia" w:hAnsi="Georgia"/>
+          <w:color w:val="1E1E1E"/>
+          <w:sz w:val="20"/>
+          <w:szCs w:val="20"/>
+        </w:rPr>
+        <w:t>ESP32  ·  microROS  ·  IMU integration</w:t>
       </w:r>
     </w:p>
     <w:p>
@@ -1094,19 +1106,19 @@
           <w:sz w:val="20"/>
           <w:szCs w:val="20"/>
         </w:rPr>
-        <w:t xml:space="preserve">Algorithms</w:t>
-      </w:r>
-      <w:r>
-        <w:t xml:space="preserve">	</w:t>
-      </w:r>
-      <w:r>
-        <w:rPr>
-          <w:rFonts w:ascii="Georgia" w:cs="Georgia" w:eastAsia="Georgia" w:hAnsi="Georgia"/>
-          <w:color w:val="1E1E1E"/>
-          <w:sz w:val="20"/>
-          <w:szCs w:val="20"/>
-        </w:rPr>
-        <w:t xml:space="preserve">Extended Kalman Filter  ·  Madgwick  ·  Mahony  ·  Sensor fusion</w:t>
+        <w:t>Networking</w:t>
+      </w:r>
+      <w:r>
+        <w:tab/>
+      </w:r>
+      <w:r>
+        <w:rPr>
+          <w:rFonts w:ascii="Georgia" w:cs="Georgia" w:eastAsia="Georgia" w:hAnsi="Georgia"/>
+          <w:color w:val="1E1E1E"/>
+          <w:sz w:val="20"/>
+          <w:szCs w:val="20"/>
+        </w:rPr>
+        <w:t>TCP/IP  ·  Wi-Fi data streaming  ·  V2X communication</w:t>
       </w:r>
     </w:p>
     <w:p>
@@ -1125,18 +1137,19 @@
           <w:sz w:val="20"/>
           <w:szCs w:val="20"/>
         </w:rPr>
-        <w:t>Machine Learning</w:t>
-        <w:tab/>
-        <w:t>Supervised learning  ·  Classification  ·  scikit-learn</w:t>
-      </w:r>
-      <w:r/>
-      <w:r>
-        <w:rPr>
-          <w:rFonts w:ascii="Georgia" w:cs="Georgia" w:eastAsia="Georgia" w:hAnsi="Georgia"/>
-          <w:color w:val="1E1E1E"/>
-          <w:sz w:val="20"/>
-          <w:szCs w:val="20"/>
-        </w:rPr>
+        <w:t xml:space="preserve">Algorithms</w:t>
+      </w:r>
+      <w:r>
+        <w:t xml:space="preserve">	</w:t>
+      </w:r>
+      <w:r>
+        <w:rPr>
+          <w:rFonts w:ascii="Georgia" w:cs="Georgia" w:eastAsia="Georgia" w:hAnsi="Georgia"/>
+          <w:color w:val="1E1E1E"/>
+          <w:sz w:val="20"/>
+          <w:szCs w:val="20"/>
+        </w:rPr>
+        <w:t xml:space="preserve">Extended Kalman Filter  ·  Madgwick  ·  Mahony  ·  Sensor fusion</w:t>
       </w:r>
     </w:p>
     <w:p>
@@ -1155,18 +1168,19 @@
           <w:sz w:val="20"/>
           <w:szCs w:val="20"/>
         </w:rPr>
-        <w:t>Frontend</w:t>
+        <w:t>Machine Learning</w:t>
+      </w:r>
+      <w:r>
         <w:tab/>
-        <w:t>HTML  ·  CSS  ·  JavaScript</w:t>
-      </w:r>
-      <w:r/>
-      <w:r>
-        <w:rPr>
-          <w:rFonts w:ascii="Georgia" w:cs="Georgia" w:eastAsia="Georgia" w:hAnsi="Georgia"/>
-          <w:color w:val="1E1E1E"/>
-          <w:sz w:val="20"/>
-          <w:szCs w:val="20"/>
-        </w:rPr>
+      </w:r>
+      <w:r>
+        <w:rPr>
+          <w:rFonts w:ascii="Georgia" w:cs="Georgia" w:eastAsia="Georgia" w:hAnsi="Georgia"/>
+          <w:color w:val="1E1E1E"/>
+          <w:sz w:val="20"/>
+          <w:szCs w:val="20"/>
+        </w:rPr>
+        <w:t>Supervised learning  ·  Classification  ·  scikit-learn</w:t>
       </w:r>
     </w:p>
     <w:p>
@@ -1185,19 +1199,18 @@
           <w:sz w:val="20"/>
           <w:szCs w:val="20"/>
         </w:rPr>
-        <w:t xml:space="preserve">Databases</w:t>
-      </w:r>
-      <w:r>
-        <w:t xml:space="preserve">	</w:t>
-      </w:r>
-      <w:r>
-        <w:rPr>
-          <w:rFonts w:ascii="Georgia" w:cs="Georgia" w:eastAsia="Georgia" w:hAnsi="Georgia"/>
-          <w:color w:val="1E1E1E"/>
-          <w:sz w:val="20"/>
-          <w:szCs w:val="20"/>
-        </w:rPr>
-        <w:t xml:space="preserve">SQL  ·  MySQL  ·  Database design</w:t>
+        <w:t>Frontend</w:t>
+        <w:tab/>
+        <w:t>HTML  ·  CSS  ·  JavaScript</w:t>
+      </w:r>
+      <w:r/>
+      <w:r>
+        <w:rPr>
+          <w:rFonts w:ascii="Georgia" w:cs="Georgia" w:eastAsia="Georgia" w:hAnsi="Georgia"/>
+          <w:color w:val="1E1E1E"/>
+          <w:sz w:val="20"/>
+          <w:szCs w:val="20"/>
+        </w:rPr>
       </w:r>
     </w:p>
     <w:p>
@@ -1216,7 +1229,7 @@
           <w:sz w:val="20"/>
           <w:szCs w:val="20"/>
         </w:rPr>
-        <w:t xml:space="preserve">Tools</w:t>
+        <w:t xml:space="preserve">Databases</w:t>
       </w:r>
       <w:r>
         <w:t xml:space="preserve">	</w:t>
@@ -1228,7 +1241,7 @@
           <w:sz w:val="20"/>
           <w:szCs w:val="20"/>
         </w:rPr>
-        <w:t xml:space="preserve">MediaPipe  ·  Git  ·  ROS</w:t>
+        <w:t xml:space="preserve">SQL  ·  MySQL  ·  Database design</w:t>
       </w:r>
     </w:p>
     <w:p>
@@ -1247,19 +1260,50 @@
           <w:sz w:val="20"/>
           <w:szCs w:val="20"/>
         </w:rPr>
-        <w:t xml:space="preserve">Methods</w:t>
-      </w:r>
-      <w:r>
-        <w:t xml:space="preserve">	</w:t>
-      </w:r>
-      <w:r>
-        <w:rPr>
-          <w:rFonts w:ascii="Georgia" w:cs="Georgia" w:eastAsia="Georgia" w:hAnsi="Georgia"/>
-          <w:color w:val="1E1E1E"/>
-          <w:sz w:val="20"/>
-          <w:szCs w:val="20"/>
-        </w:rPr>
-        <w:t xml:space="preserve">Algorithm development  ·  Data collection &amp; validation  ·  Technical documentation</w:t>
+        <w:t>Tools</w:t>
+      </w:r>
+      <w:r>
+        <w:tab/>
+      </w:r>
+      <w:r>
+        <w:rPr>
+          <w:rFonts w:ascii="Georgia" w:cs="Georgia" w:eastAsia="Georgia" w:hAnsi="Georgia"/>
+          <w:color w:val="1E1E1E"/>
+          <w:sz w:val="20"/>
+          <w:szCs w:val="20"/>
+        </w:rPr>
+        <w:t>Linux  ·  Windows  ·  Git  ·  ROS  ·  MediaPipe</w:t>
+      </w:r>
+    </w:p>
+    <w:p>
+      <w:pPr>
+        <w:tabs>
+          <w:tab w:val="left" w:pos="1700"/>
+        </w:tabs>
+        <w:spacing w:after="38" w:before="38"/>
+      </w:pPr>
+      <w:r>
+        <w:rPr>
+          <w:rFonts w:ascii="Georgia" w:cs="Georgia" w:eastAsia="Georgia" w:hAnsi="Georgia"/>
+          <w:b/>
+          <w:bCs/>
+          <w:color w:val="5B8DB8"/>
+          <w:sz w:val="20"/>
+          <w:szCs w:val="20"/>
+        </w:rPr>
+        <w:t>Methods</w:t>
+      </w:r>
+      <w:r>
+        <w:tab/>
+      </w:r>
+      <w:r>
+        <w:rPr>
+          <w:rFonts w:ascii="Georgia" w:cs="Georgia" w:eastAsia="Georgia" w:hAnsi="Georgia"/>
+          <w:color w:val="1E1E1E"/>
+          <w:sz w:val="20"/>
+          <w:szCs w:val="20"/>
+        </w:rPr>
+        <w:t>Testing &amp; validation  ·  Debugging  ·  Agile teamwork  ·  Technical documentation</w:t>
       </w:r>
     </w:p>
     <w:p>
@@ -1463,6 +1507,134 @@
     </w:p>
     <w:p>
       <w:pPr>
+        <w:spacing w:after="16" w:before="120"/>
+      </w:pPr>
+      <w:r>
+        <w:rPr>
+          <w:rFonts w:ascii="Georgia" w:cs="Georgia" w:eastAsia="Georgia" w:hAnsi="Georgia"/>
+          <w:b/>
+          <w:bCs/>
+          <w:color w:val="2C2C2C"/>
+          <w:sz w:val="21"/>
+          <w:szCs w:val="21"/>
+        </w:rPr>
+        <w:t xml:space="preserve">Josefin</w:t>
+      </w:r>
+    </w:p>
+    <w:p>
+      <w:pPr>
+        <w:spacing w:after="16" w:before="0"/>
+      </w:pPr>
+      <w:r>
+        <w:rPr>
+          <w:rFonts w:ascii="Georgia" w:cs="Georgia" w:eastAsia="Georgia" w:hAnsi="Georgia"/>
+          <w:i/>
+          <w:iCs/>
+          <w:color w:val="555555"/>
+          <w:sz w:val="20"/>
+          <w:szCs w:val="20"/>
+        </w:rPr>
+        <w:t xml:space="preserve">Operations Manager  ·  Blomsterlandet</w:t>
+      </w:r>
+    </w:p>
+    <w:p>
+      <w:pPr>
+        <w:spacing w:after="16" w:before="120"/>
+      </w:pPr>
+      <w:r>
+        <w:rPr>
+          <w:rFonts w:ascii="Georgia" w:cs="Georgia" w:eastAsia="Georgia" w:hAnsi="Georgia"/>
+          <w:b/>
+          <w:bCs/>
+          <w:color w:val="2C2C2C"/>
+          <w:sz w:val="21"/>
+          <w:szCs w:val="21"/>
+        </w:rPr>
+        <w:t xml:space="preserve">Harald</w:t>
+      </w:r>
+    </w:p>
+    <w:p>
+      <w:pPr>
+        <w:spacing w:after="16" w:before="0"/>
+      </w:pPr>
+      <w:r>
+        <w:rPr>
+          <w:rFonts w:ascii="Georgia" w:cs="Georgia" w:eastAsia="Georgia" w:hAnsi="Georgia"/>
+          <w:i/>
+          <w:iCs/>
+          <w:color w:val="555555"/>
+          <w:sz w:val="20"/>
+          <w:szCs w:val="20"/>
+        </w:rPr>
+        <w:t xml:space="preserve">Operations Manager  ·  Blomsterlandet</w:t>
+      </w:r>
+    </w:p>
+    <w:p>
+      <w:pPr>
+        <w:spacing w:after="16" w:before="120"/>
+      </w:pPr>
+      <w:r>
+        <w:rPr>
+          <w:rFonts w:ascii="Georgia" w:cs="Georgia" w:eastAsia="Georgia" w:hAnsi="Georgia"/>
+          <w:b/>
+          <w:bCs/>
+          <w:color w:val="2C2C2C"/>
+          <w:sz w:val="21"/>
+          <w:szCs w:val="21"/>
+        </w:rPr>
+        <w:t xml:space="preserve">Amina</w:t>
+      </w:r>
+    </w:p>
+    <w:p>
+      <w:pPr>
+        <w:spacing w:after="16" w:before="0"/>
+      </w:pPr>
+      <w:r>
+        <w:rPr>
+          <w:rFonts w:ascii="Georgia" w:cs="Georgia" w:eastAsia="Georgia" w:hAnsi="Georgia"/>
+          <w:i/>
+          <w:iCs/>
+          <w:color w:val="555555"/>
+          <w:sz w:val="20"/>
+          <w:szCs w:val="20"/>
+        </w:rPr>
+        <w:t xml:space="preserve">Manager  ·  Job and Talent</w:t>
+      </w:r>
+    </w:p>
+    <w:p>
+      <w:pPr>
+        <w:spacing w:after="16" w:before="120"/>
+      </w:pPr>
+      <w:r>
+        <w:rPr>
+          <w:rFonts w:ascii="Georgia" w:cs="Georgia" w:eastAsia="Georgia" w:hAnsi="Georgia"/>
+          <w:b/>
+          <w:bCs/>
+          <w:color w:val="2C2C2C"/>
+          <w:sz w:val="21"/>
+          <w:szCs w:val="21"/>
+        </w:rPr>
+        <w:t xml:space="preserve">Christian Nils</w:t>
+      </w:r>
+    </w:p>
+    <w:p>
+      <w:pPr>
+        <w:spacing w:after="16" w:before="0"/>
+      </w:pPr>
+      <w:r>
+        <w:rPr>
+          <w:rFonts w:ascii="Georgia" w:cs="Georgia" w:eastAsia="Georgia" w:hAnsi="Georgia"/>
+          <w:i/>
+          <w:iCs/>
+          <w:color w:val="555555"/>
+          <w:sz w:val="20"/>
+          <w:szCs w:val="20"/>
+        </w:rPr>
+        <w:t xml:space="preserve">Product Manager  ·  Autoliv</w:t>
+      </w:r>
+    </w:p>
+    <w:p>
+      <w:pPr>
         <w:spacing w:after="0" w:before="0"/>
       </w:pPr>
       <w:r>
@@ -1472,191 +1644,7 @@
           <w:sz w:val="19"/>
           <w:szCs w:val="19"/>
         </w:rPr>
-        <w:t xml:space="preserve">Phone: _______________   |   Email: _______________</w:t>
-      </w:r>
-    </w:p>
-    <w:p>
-      <w:pPr>
-        <w:spacing w:after="16" w:before="120"/>
-      </w:pPr>
-      <w:r>
-        <w:rPr>
-          <w:rFonts w:ascii="Georgia" w:cs="Georgia" w:eastAsia="Georgia" w:hAnsi="Georgia"/>
-          <w:b/>
-          <w:bCs/>
-          <w:color w:val="2C2C2C"/>
-          <w:sz w:val="21"/>
-          <w:szCs w:val="21"/>
-        </w:rPr>
-        <w:t xml:space="preserve">Josefin</w:t>
-      </w:r>
-    </w:p>
-    <w:p>
-      <w:pPr>
-        <w:spacing w:after="16" w:before="0"/>
-      </w:pPr>
-      <w:r>
-        <w:rPr>
-          <w:rFonts w:ascii="Georgia" w:cs="Georgia" w:eastAsia="Georgia" w:hAnsi="Georgia"/>
-          <w:i/>
-          <w:iCs/>
-          <w:color w:val="555555"/>
-          <w:sz w:val="20"/>
-          <w:szCs w:val="20"/>
-        </w:rPr>
-        <w:t xml:space="preserve">Operations Manager  ·  Blomsterlandet</w:t>
-      </w:r>
-    </w:p>
-    <w:p>
-      <w:pPr>
-        <w:spacing w:after="0" w:before="0"/>
-      </w:pPr>
-      <w:r>
-        <w:rPr>
-          <w:rFonts w:ascii="Georgia" w:cs="Georgia" w:eastAsia="Georgia" w:hAnsi="Georgia"/>
-          <w:color w:val="BBBBBB"/>
-          <w:sz w:val="19"/>
-          <w:szCs w:val="19"/>
-        </w:rPr>
-        <w:t xml:space="preserve">Phone: _______________   |   Email: _______________</w:t>
-      </w:r>
-    </w:p>
-    <w:p>
-      <w:pPr>
-        <w:spacing w:after="16" w:before="120"/>
-      </w:pPr>
-      <w:r>
-        <w:rPr>
-          <w:rFonts w:ascii="Georgia" w:cs="Georgia" w:eastAsia="Georgia" w:hAnsi="Georgia"/>
-          <w:b/>
-          <w:bCs/>
-          <w:color w:val="2C2C2C"/>
-          <w:sz w:val="21"/>
-          <w:szCs w:val="21"/>
-        </w:rPr>
-        <w:t xml:space="preserve">Harald</w:t>
-      </w:r>
-    </w:p>
-    <w:p>
-      <w:pPr>
-        <w:spacing w:after="16" w:before="0"/>
-      </w:pPr>
-      <w:r>
-        <w:rPr>
-          <w:rFonts w:ascii="Georgia" w:cs="Georgia" w:eastAsia="Georgia" w:hAnsi="Georgia"/>
-          <w:i/>
-          <w:iCs/>
-          <w:color w:val="555555"/>
-          <w:sz w:val="20"/>
-          <w:szCs w:val="20"/>
-        </w:rPr>
-        <w:t xml:space="preserve">Operations Manager  ·  Blomsterlandet</w:t>
-      </w:r>
-    </w:p>
-    <w:p>
-      <w:pPr>
-        <w:spacing w:after="0" w:before="0"/>
-      </w:pPr>
-      <w:r>
-        <w:rPr>
-          <w:rFonts w:ascii="Georgia" w:cs="Georgia" w:eastAsia="Georgia" w:hAnsi="Georgia"/>
-          <w:color w:val="BBBBBB"/>
-          <w:sz w:val="19"/>
-          <w:szCs w:val="19"/>
-        </w:rPr>
-        <w:t xml:space="preserve">Phone: _______________   |   Email: _______________</w:t>
-      </w:r>
-    </w:p>
-    <w:p>
-      <w:pPr>
-        <w:spacing w:after="16" w:before="120"/>
-      </w:pPr>
-      <w:r>
-        <w:rPr>
-          <w:rFonts w:ascii="Georgia" w:cs="Georgia" w:eastAsia="Georgia" w:hAnsi="Georgia"/>
-          <w:b/>
-          <w:bCs/>
-          <w:color w:val="2C2C2C"/>
-          <w:sz w:val="21"/>
-          <w:szCs w:val="21"/>
-        </w:rPr>
-        <w:t xml:space="preserve">Amina</w:t>
-      </w:r>
-    </w:p>
-    <w:p>
-      <w:pPr>
-        <w:spacing w:after="16" w:before="0"/>
-      </w:pPr>
-      <w:r>
-        <w:rPr>
-          <w:rFonts w:ascii="Georgia" w:cs="Georgia" w:eastAsia="Georgia" w:hAnsi="Georgia"/>
-          <w:i/>
-          <w:iCs/>
-          <w:color w:val="555555"/>
-          <w:sz w:val="20"/>
-          <w:szCs w:val="20"/>
-        </w:rPr>
-        <w:t xml:space="preserve">Manager  ·  Job and Talent</w:t>
-      </w:r>
-    </w:p>
-    <w:p>
-      <w:pPr>
-        <w:spacing w:after="0" w:before="0"/>
-      </w:pPr>
-      <w:r>
-        <w:rPr>
-          <w:rFonts w:ascii="Georgia" w:cs="Georgia" w:eastAsia="Georgia" w:hAnsi="Georgia"/>
-          <w:color w:val="BBBBBB"/>
-          <w:sz w:val="19"/>
-          <w:szCs w:val="19"/>
-        </w:rPr>
-        <w:t xml:space="preserve">Phone: _______________   |   Email: _______________</w:t>
-      </w:r>
-    </w:p>
-    <w:p>
-      <w:pPr>
-        <w:spacing w:after="16" w:before="120"/>
-      </w:pPr>
-      <w:r>
-        <w:rPr>
-          <w:rFonts w:ascii="Georgia" w:cs="Georgia" w:eastAsia="Georgia" w:hAnsi="Georgia"/>
-          <w:b/>
-          <w:bCs/>
-          <w:color w:val="2C2C2C"/>
-          <w:sz w:val="21"/>
-          <w:szCs w:val="21"/>
-        </w:rPr>
-        <w:t xml:space="preserve">Christian Nils</w:t>
-      </w:r>
-    </w:p>
-    <w:p>
-      <w:pPr>
-        <w:spacing w:after="16" w:before="0"/>
-      </w:pPr>
-      <w:r>
-        <w:rPr>
-          <w:rFonts w:ascii="Georgia" w:cs="Georgia" w:eastAsia="Georgia" w:hAnsi="Georgia"/>
-          <w:i/>
-          <w:iCs/>
-          <w:color w:val="555555"/>
-          <w:sz w:val="20"/>
-          <w:szCs w:val="20"/>
-        </w:rPr>
-        <w:t xml:space="preserve">Product Manager  ·  Autoliv</w:t>
-      </w:r>
-    </w:p>
-    <w:p>
-      <w:pPr>
-        <w:spacing w:after="0" w:before="0"/>
-      </w:pPr>
-      <w:r>
-        <w:rPr>
-          <w:rFonts w:ascii="Georgia" w:cs="Georgia" w:eastAsia="Georgia" w:hAnsi="Georgia"/>
-          <w:color w:val="BBBBBB"/>
-          <w:sz w:val="19"/>
-          <w:szCs w:val="19"/>
-        </w:rPr>
-        <w:t xml:space="preserve">Phone: _______________   |   Email: _______________</w:t>
+        <w:t>Full contact details gladly provided upon request.</w:t>
       </w:r>
     </w:p>
     <w:p>

</xml_diff>